<commit_message>
Add tenant usage quotas
</commit_message>
<xml_diff>
--- a/docs/Veritrace-Design-Document.docx
+++ b/docs/Veritrace-Design-Document.docx
@@ -35,7 +35,7 @@
     </w:p>
     <w:p>
       <w:r>
-        <w:t xml:space="preserve">What is implemented and tested today: orchestrated pipeline, TraceEvent contract, hash-chain audit, RCA replay/counterfactual basics, context-guarded PII scrubbing, isolation heuristics with classifier hook, SafetyLayer rules, ToolGuardLayer with JSON-schema-style validation, side-effect taxonomy, argument injection scanning, output provenance checks, dangerous tool-chain escalation, Slack HITL with signed callbacks, API-key plus JWT auth, rate limiting, Redis/Postgres backend options, Docker Compose, CLI init/validate, OpenTelemetry layer spans, compliance report helpers, and an admin dashboard skeleton.</w:t>
+        <w:t xml:space="preserve">What is implemented and tested today: orchestrated pipeline, TraceEvent contract, hash-chain audit, RCA replay/counterfactual basics, context-guarded PII scrubbing, isolation heuristics with classifier hook, SafetyLayer rules, ToolGuardLayer with JSON-schema-style validation, side-effect taxonomy, argument injection scanning, output provenance checks, dangerous tool-chain escalation, Slack HITL with signed callbacks, API-key plus JWT auth, rate limiting, per-tenant usage quotas, Redis/Postgres backend options, Docker Compose, CLI init/validate, OpenTelemetry layer spans, compliance report helpers, and an admin dashboard skeleton.</w:t>
       </w:r>
     </w:p>
     <w:p>
@@ -45,12 +45,12 @@
     </w:p>
     <w:p>
       <w:r>
-        <w:t xml:space="preserve">What still needs hardening before regulated production: adversarial prompt defense beyond heuristics and small classifiers, persistent multi-worker HITL queues in real deployments, stronger dashboard identity/tenant controls, broader red-team coverage, operational runbooks, external security review, mature migrations, quota/budget enforcement, and production-tested Postgres/Redis/OTel deployments.</w:t>
-      </w:r>
-    </w:p>
-    <w:p>
-      <w:r>
-        <w:t xml:space="preserve">Capability matrix: Provider adapters - implemented; Compliance/PII - implemented with limits; Isolation - implemented but heuristic/classifier-dependent; Safety rules - implemented; ToolGuard - strong MVP, not a sandbox; HITL - Slack plus workflow primitives, persistence depends on backend configuration; Reliability - timeouts/circuit breaker implemented; Trace/hash chain - implemented; RCA - useful for linear and tool traces, not full emergent multi-agent forensics; Observability - metrics and spans implemented, dashboards not battle-tested; QuantumLayer - research only, not near-term product.</w:t>
+        <w:t xml:space="preserve">What still needs hardening before regulated production: adversarial prompt defense beyond heuristics and small classifiers, persistent multi-worker HITL queues in real deployments, stronger dashboard identity/tenant controls, broader red-team coverage, operational runbooks, external security review, mature migrations, external billing integration, and production-tested Postgres/Redis/OTel deployments.</w:t>
+      </w:r>
+    </w:p>
+    <w:p>
+      <w:r>
+        <w:t xml:space="preserve">Capability matrix: Provider adapters - implemented; Usage quotas - implemented for call/tool/spend caps; Compliance/PII - implemented with limits; Isolation - implemented but heuristic/classifier-dependent; Safety rules - implemented; ToolGuard - strong MVP, not a sandbox; HITL - Slack plus workflow primitives, persistence depends on backend configuration; Reliability - timeouts/circuit breaker implemented; Trace/hash chain - implemented; RCA - useful for linear and tool traces, not full emergent multi-agent forensics; Observability - metrics and spans implemented, dashboards not battle-tested; QuantumLayer - research only, not near-term product.</w:t>
       </w:r>
     </w:p>
     <w:p>

</xml_diff>

<commit_message>
Harden release credibility checks
</commit_message>
<xml_diff>
--- a/docs/Veritrace-Design-Document.docx
+++ b/docs/Veritrace-Design-Document.docx
@@ -30,27 +30,27 @@
     </w:p>
     <w:p>
       <w:r>
-        <w:t xml:space="preserve">This section is intentionally blunt. The original vision in this document is the target architecture, not a claim that every enterprise-grade control is mature today.</w:t>
-      </w:r>
-    </w:p>
-    <w:p>
-      <w:r>
-        <w:t xml:space="preserve">What is implemented and tested today: orchestrated pipeline, TraceEvent contract, hash-chain audit, RCA replay/counterfactual basics, context-guarded PII scrubbing, isolation heuristics with classifier hook, SafetyLayer rules, ToolGuardLayer with JSON-schema-style validation, side-effect taxonomy, argument injection scanning, output provenance checks, dangerous tool-chain escalation, Slack HITL with signed callbacks, API-key plus JWT auth, rate limiting, per-tenant usage quotas, Redis/Postgres backend options, Docker Compose, CLI init/validate, OpenTelemetry layer spans, compliance report helpers, and an admin dashboard skeleton.</w:t>
-      </w:r>
-    </w:p>
-    <w:p>
-      <w:r>
-        <w:t xml:space="preserve">What is pilot-ready: low/medium-stakes internal tools, interview demos, controlled agent workflows, local or hosted LLM provider wrapping, Slack approval demos, trace replay, and tamper-evidence demonstrations.</w:t>
-      </w:r>
-    </w:p>
-    <w:p>
-      <w:r>
-        <w:t xml:space="preserve">What still needs hardening before regulated production: adversarial prompt defense beyond heuristics and small classifiers, persistent multi-worker HITL queues in real deployments, stronger dashboard identity/tenant controls, broader red-team coverage, operational runbooks, external security review, mature migrations, external billing integration, and production-tested Postgres/Redis/OTel deployments.</w:t>
-      </w:r>
-    </w:p>
-    <w:p>
-      <w:r>
-        <w:t xml:space="preserve">Capability matrix: Provider adapters - implemented; Usage quotas - implemented for call/tool/spend caps; Compliance/PII - implemented with limits; Isolation - implemented but heuristic/classifier-dependent; Safety rules - implemented; ToolGuard - strong MVP, not a sandbox; HITL - Slack plus workflow primitives, persistence depends on backend configuration; Reliability - timeouts/circuit breaker implemented; Trace/hash chain - implemented; RCA - useful for linear and tool traces, not full emergent multi-agent forensics; Observability - metrics and spans implemented, dashboards not battle-tested; QuantumLayer - research only, not near-term product.</w:t>
+        <w:t xml:space="preserve">This section is intentionally blunt. The original vision in this document is the target architecture, not a claim that every enterprise-grade control is mature today. Current local validation: python -m pytest -q passes with 327 passing, 3 expected xfails, and 2 warnings. A syntax-health test now compiles every Python source file so store.py-style collection failures are caught immediately.</w:t>
+      </w:r>
+    </w:p>
+    <w:p>
+      <w:r>
+        <w:t xml:space="preserve">What is implemented and tested today: orchestrated pipeline, TraceEvent contract, hash-chain audit, RCA replay/counterfactual basics, context-guarded PII scrubbing, isolation heuristics with classifier hook, SafetyLayer rules, ToolGuardLayer with JSON-schema-style validation, side-effect taxonomy, argument injection scanning, output provenance checks, dangerous tool-chain escalation, Slack HITL with signed callbacks, API-key plus JWT auth, rate limiting, per-tenant usage quotas, quota/rate-limit interaction tests, Redis/Postgres backend options, Docker Compose, CLI init/validate, OpenTelemetry layer spans, compliance report helpers, syntax-health checks, concurrency smoke tests, and an admin dashboard skeleton with tenant-scoped config.</w:t>
+      </w:r>
+    </w:p>
+    <w:p>
+      <w:r>
+        <w:t xml:space="preserve">What is pilot-ready: low/medium-stakes internal tools, interview demos, controlled agent workflows, local or hosted LLM provider wrapping, Slack approval demos, trace replay, quota demonstrations, and tamper-evidence demonstrations.</w:t>
+      </w:r>
+    </w:p>
+    <w:p>
+      <w:r>
+        <w:t xml:space="preserve">What still needs hardening before regulated production: adversarial prompt defense beyond heuristics and small classifiers, persistent multi-worker HITL queues in real deployments, SSO/OIDC/RBAC-grade dashboard identity controls, broader red-team coverage, load/chaos testing, operational runbooks, external security review, mature migrations, external billing integration, and production-tested Postgres/Redis/OTel deployments.</w:t>
+      </w:r>
+    </w:p>
+    <w:p>
+      <w:r>
+        <w:t xml:space="preserve">Capability matrix: Provider adapters - implemented; Usage quotas - implemented for call/tool/spend caps, no billing ledger; Compliance/PII - implemented with limits; Isolation - implemented but heuristic/classifier-dependent; Safety rules - implemented; ToolGuard - strong MVP, not a sandbox; HITL - Slack plus workflow primitives, persistence depends on backend configuration; Reliability - timeouts/circuit breaker implemented, chaos recovery not proven; Trace/hash chain - implemented; RCA - useful for linear and tool traces, not full emergent multi-agent forensics; Observability - metrics and spans implemented, dashboards not battle-tested; Load testing - smoke-tested only, not benchmarked at scale; Dashboard - tenant-scoped config, not SSO/OIDC/RBAC; QuantumLayer - research only, not near-term product.</w:t>
       </w:r>
     </w:p>
     <w:p>

</xml_diff>

<commit_message>
Add usage hooks and redteam reporting
</commit_message>
<xml_diff>
--- a/docs/Veritrace-Design-Document.docx
+++ b/docs/Veritrace-Design-Document.docx
@@ -30,12 +30,12 @@
     </w:p>
     <w:p>
       <w:r>
-        <w:t xml:space="preserve">This section is intentionally blunt. The original vision in this document is the target architecture, not a claim that every enterprise-grade control is mature today. Current local validation: python -m pytest -q passes with 327 passing, 3 expected xfails, and 2 warnings. A syntax-health test now compiles every Python source file so store.py-style collection failures are caught immediately.</w:t>
-      </w:r>
-    </w:p>
-    <w:p>
-      <w:r>
-        <w:t xml:space="preserve">What is implemented and tested today: orchestrated pipeline, TraceEvent contract, hash-chain audit, RCA replay/counterfactual basics, context-guarded PII scrubbing, isolation heuristics with classifier hook, SafetyLayer rules, ToolGuardLayer with JSON-schema-style validation, side-effect taxonomy, argument injection scanning, output provenance checks, dangerous tool-chain escalation, Slack HITL with signed callbacks, API-key plus JWT auth, rate limiting, per-tenant usage quotas, quota/rate-limit interaction tests, Redis/Postgres backend options, Docker Compose, CLI init/validate, OpenTelemetry layer spans, compliance report helpers, syntax-health checks, concurrency smoke tests, and an admin dashboard skeleton with tenant-scoped config.</w:t>
+        <w:t xml:space="preserve">This section is intentionally blunt. The original vision in this document is the target architecture, not a claim that every enterprise-grade control is mature today. Current local validation: python -m pytest -q passes with 334 passing, 3 expected xfails, and 2 warnings. A syntax-health test now compiles every Python source file so store.py-style collection failures are caught immediately.</w:t>
+      </w:r>
+    </w:p>
+    <w:p>
+      <w:r>
+        <w:t xml:space="preserve">What is implemented and tested today: orchestrated pipeline, TraceEvent contract, hash-chain audit, RCA replay/counterfactual basics, context-guarded PII scrubbing, isolation heuristics with classifier hook, SafetyLayer rules, ToolGuardLayer with JSON-schema-style validation, side-effect taxonomy, argument injection scanning, output provenance checks, dangerous tool-chain escalation, Slack HITL with signed callbacks, API-key plus JWT auth, rate limiting, per-tenant usage quotas, fail-open usage/billing webhooks, quota/rate-limit interaction tests, Redis/Postgres backend options, Docker Compose, CLI init/validate/redteam, OpenTelemetry layer spans, compliance report helpers, syntax-health checks, concurrency smoke tests, and an admin dashboard skeleton with tenant-scoped config plus explicit super-admin opt-in.</w:t>
       </w:r>
     </w:p>
     <w:p>
@@ -45,12 +45,12 @@
     </w:p>
     <w:p>
       <w:r>
-        <w:t xml:space="preserve">What still needs hardening before regulated production: adversarial prompt defense beyond heuristics and small classifiers, persistent multi-worker HITL queues in real deployments, SSO/OIDC/RBAC-grade dashboard identity controls, broader red-team coverage, load/chaos testing, operational runbooks, external security review, mature migrations, external billing integration, and production-tested Postgres/Redis/OTel deployments.</w:t>
-      </w:r>
-    </w:p>
-    <w:p>
-      <w:r>
-        <w:t xml:space="preserve">Capability matrix: Provider adapters - implemented; Usage quotas - implemented for call/tool/spend caps, no billing ledger; Compliance/PII - implemented with limits; Isolation - implemented but heuristic/classifier-dependent; Safety rules - implemented; ToolGuard - strong MVP, not a sandbox; HITL - Slack plus workflow primitives, persistence depends on backend configuration; Reliability - timeouts/circuit breaker implemented, chaos recovery not proven; Trace/hash chain - implemented; RCA - useful for linear and tool traces, not full emergent multi-agent forensics; Observability - metrics and spans implemented, dashboards not battle-tested; Load testing - smoke-tested only, not benchmarked at scale; Dashboard - tenant-scoped config, not SSO/OIDC/RBAC; QuantumLayer - research only, not near-term product.</w:t>
+        <w:t xml:space="preserve">What still needs hardening before regulated production: adversarial prompt defense beyond heuristics and small classifiers, persistent multi-worker HITL queues in real deployments, SSO/OIDC/RBAC-grade dashboard identity controls, professional red-team coverage beyond the built-in corpus, load/chaos testing, operational runbooks, external security review, mature migrations, durable Stripe/Chargebee-style billing ledgers, and production-tested Postgres/Redis/OTel deployments.</w:t>
+      </w:r>
+    </w:p>
+    <w:p>
+      <w:r>
+        <w:t xml:space="preserve">Capability matrix: Provider adapters - implemented; Usage quotas - implemented for call/tool/spend caps plus fail-open webhook, no Stripe/Chargebee ledger; Compliance/PII - implemented with limits; Isolation - implemented but heuristic/classifier-dependent; Safety rules - implemented; ToolGuard - strong MVP, not a sandbox; HITL - Slack plus workflow primitives, persistence depends on backend configuration; Reliability - timeouts/circuit breaker implemented, chaos recovery not proven; Trace/hash chain - implemented; RCA - useful for linear and tool traces, not full emergent multi-agent forensics; Observability - metrics and spans implemented, dashboards not battle-tested; Load testing - smoke-tested only, not benchmarked at scale; Dashboard - tenant-scoped config, not SSO/OIDC/RBAC; QuantumLayer - research only, not near-term product.</w:t>
       </w:r>
     </w:p>
     <w:p>

</xml_diff>

<commit_message>
Tighten docs and dashboard operations
</commit_message>
<xml_diff>
--- a/docs/Veritrace-Design-Document.docx
+++ b/docs/Veritrace-Design-Document.docx
@@ -30,7 +30,7 @@
     </w:p>
     <w:p>
       <w:r>
-        <w:t xml:space="preserve">This section is intentionally blunt. The original vision in this document is the target architecture, not a claim that every enterprise-grade control is mature today. Current local validation: python -m pytest -q passes with 334 passing, 3 expected xfails, and 2 warnings. A syntax-health test now compiles every Python source file so store.py-style collection failures are caught immediately.</w:t>
+        <w:t xml:space="preserve">This section is intentionally blunt. The original vision in this document is the target architecture, not a claim that every enterprise-grade control is mature today. Current local validation: python -m pytest -q --tb=no passes with 336 passing, 3 expected xfails, and 2 warnings. A syntax-health test now compiles every Python source file so store.py-style collection failures are caught immediately.</w:t>
       </w:r>
     </w:p>
     <w:p>
@@ -50,7 +50,7 @@
     </w:p>
     <w:p>
       <w:r>
-        <w:t xml:space="preserve">Capability matrix: Provider adapters - implemented; Usage quotas - implemented for call/tool/spend caps plus fail-open webhook, no Stripe/Chargebee ledger; Compliance/PII - implemented with limits; Isolation - implemented but heuristic/classifier-dependent; Safety rules - implemented; ToolGuard - strong MVP, not a sandbox; HITL - Slack plus workflow primitives, persistence depends on backend configuration; Reliability - timeouts/circuit breaker implemented, chaos recovery not proven; Trace/hash chain - implemented; RCA - useful for linear and tool traces, not full emergent multi-agent forensics; Observability - metrics and spans implemented, dashboards not battle-tested; Load testing - smoke-tested only, not benchmarked at scale; Dashboard - tenant-scoped config, not SSO/OIDC/RBAC; QuantumLayer - research only, not near-term product.</w:t>
+        <w:t xml:space="preserve">Capability matrix: Provider adapters - implemented; Usage quotas - implemented for call/tool/spend caps plus fail-open webhook, no Stripe/Chargebee ledger; Compliance/PII - implemented with limits; Isolation - implemented but heuristic/classifier-dependent; Safety rules - implemented; ToolGuard - strong MVP, not a sandbox; HITL - Slack plus workflow primitives, persistence depends on backend configuration; Reliability - timeouts/circuit breaker implemented, chaos recovery not proven; Trace/hash chain - implemented; RCA - useful for linear and tool traces, not full emergent multi-agent forensics; Observability - metrics and spans implemented, dashboards not battle-tested; Load testing - smoke-tested only, no published scale benchmark yet; Dashboard - tenant-scoped config, Redis-backed throttling, usage page, not SSO/OIDC/RBAC; QuantumLayer - research only, not near-term product.</w:t>
       </w:r>
     </w:p>
     <w:p>
@@ -2419,7 +2419,7 @@
                 <w:sz w:val="18"/>
                 <w:szCs w:val="18"/>
               </w:rPr>
-              <w:t xml:space="preserve">No data crosses tenant or session boundaries, even under adversarial prompting</w:t>
+              <w:t xml:space="preserve">Tenant/session scoping with tested boundaries; not a hardened sandbox</w:t>
             </w:r>
           </w:p>
         </w:tc>
@@ -2529,7 +2529,7 @@
                 <w:sz w:val="18"/>
                 <w:szCs w:val="18"/>
               </w:rPr>
-              <w:t xml:space="preserve">Deterministic boundaries the model cannot cross; input and output screening</w:t>
+              <w:t xml:space="preserve">Deterministic policy gates around the model; input and output screening</w:t>
             </w:r>
           </w:p>
         </w:tc>
@@ -2749,7 +2749,7 @@
                 <w:sz w:val="18"/>
                 <w:szCs w:val="18"/>
               </w:rPr>
-              <w:t xml:space="preserve">Bounded concurrency, timeouts, and graceful degradation; no crashes, no hangs</w:t>
+              <w:t xml:space="preserve">Bounded concurrency, timeouts, and graceful degradation targets</w:t>
             </w:r>
           </w:p>
         </w:tc>

</xml_diff>

<commit_message>
Add Sepolia anchoring and S3 archive
</commit_message>
<xml_diff>
--- a/docs/Veritrace-Design-Document.docx
+++ b/docs/Veritrace-Design-Document.docx
@@ -30,12 +30,12 @@
     </w:p>
     <w:p>
       <w:r>
-        <w:t xml:space="preserve">This section is intentionally blunt. The original vision in this document is the target architecture, not a claim that every enterprise-grade control is mature today. Current local validation: python -m pytest -q --tb=no passes with 336 passing, 3 expected xfails, and 2 warnings. A syntax-health test now compiles every Python source file so store.py-style collection failures are caught immediately.</w:t>
-      </w:r>
-    </w:p>
-    <w:p>
-      <w:r>
-        <w:t xml:space="preserve">What is implemented and tested today: orchestrated pipeline, TraceEvent contract, hash-chain audit, RCA replay/counterfactual basics, context-guarded PII scrubbing, isolation heuristics with classifier hook, SafetyLayer rules, ToolGuardLayer with JSON-schema-style validation, side-effect taxonomy, argument injection scanning, output provenance checks, dangerous tool-chain escalation, Slack HITL with signed callbacks, API-key plus JWT auth, rate limiting, per-tenant usage quotas, fail-open usage/billing webhooks, quota/rate-limit interaction tests, Redis/Postgres backend options, Docker Compose, CLI init/validate/redteam, OpenTelemetry layer spans, compliance report helpers, syntax-health checks, concurrency smoke tests, and an admin dashboard skeleton with tenant-scoped config plus explicit super-admin opt-in.</w:t>
+        <w:t xml:space="preserve">This section is intentionally blunt. The original vision in this document is the target architecture, not a claim that every enterprise-grade control is mature today. Current local validation: python -m pytest -q --tb=no passes with 344 passing, 3 expected xfails, and 2 warnings. A syntax-health test now compiles every Python source file so store.py-style collection failures are caught immediately.</w:t>
+      </w:r>
+    </w:p>
+    <w:p>
+      <w:r>
+        <w:t xml:space="preserve">What is implemented and tested today: orchestrated pipeline, TraceEvent contract, hash-chain audit, RCA replay/counterfactual basics, context-guarded PII scrubbing, isolation heuristics with classifier hook, SafetyLayer rules, ToolGuardLayer with JSON-schema-style validation, side-effect taxonomy, argument injection scanning, output provenance checks, dangerous tool-chain escalation, Slack HITL with signed callbacks, API-key plus JWT auth, rate limiting, per-tenant usage quotas, fail-open usage/billing webhooks, quota/rate-limit interaction tests, Redis/Postgres backend options, Docker Compose, CLI init/validate/redteam, OpenTelemetry layer spans, compliance report helpers, optional real Sepolia anchoring, encrypted S3 cold archive wrapper, syntax-health checks, concurrency smoke tests, and an admin dashboard skeleton with tenant-scoped config plus explicit super-admin opt-in.</w:t>
       </w:r>
     </w:p>
     <w:p>
@@ -45,12 +45,12 @@
     </w:p>
     <w:p>
       <w:r>
-        <w:t xml:space="preserve">What still needs hardening before regulated production: adversarial prompt defense beyond heuristics and small classifiers, persistent multi-worker HITL queues in real deployments, SSO/OIDC/RBAC-grade dashboard identity controls, professional red-team coverage beyond the built-in corpus, load/chaos testing, operational runbooks, external security review, mature migrations, durable Stripe/Chargebee-style billing ledgers, and production-tested Postgres/Redis/OTel deployments.</w:t>
-      </w:r>
-    </w:p>
-    <w:p>
-      <w:r>
-        <w:t xml:space="preserve">Capability matrix: Provider adapters - implemented; Usage quotas - implemented for call/tool/spend caps plus fail-open webhook, no Stripe/Chargebee ledger; Compliance/PII - implemented with limits; Isolation - implemented but heuristic/classifier-dependent; Safety rules - implemented; ToolGuard - strong MVP, not a sandbox; HITL - Slack plus workflow primitives, persistence depends on backend configuration; Reliability - timeouts/circuit breaker implemented, chaos recovery not proven; Trace/hash chain - implemented; RCA - useful for linear and tool traces, not full emergent multi-agent forensics; Observability - metrics and spans implemented, dashboards not battle-tested; Load testing - smoke-tested only, no published scale benchmark yet; Dashboard - tenant-scoped config, Redis-backed throttling, usage page, not SSO/OIDC/RBAC; QuantumLayer - research only, not near-term product.</w:t>
+        <w:t xml:space="preserve">What still needs hardening before regulated production: adversarial prompt defense beyond heuristics and small classifiers, persistent multi-worker HITL queues in real deployments, SSO/OIDC/RBAC-grade dashboard identity controls, professional red-team coverage beyond the built-in corpus, load/chaos testing, operational runbooks, external security review, mature migrations, durable Stripe/Chargebee-style billing ledgers, production key management for Ethereum/S3 credentials, AWS lifecycle/KMS runbooks, and production-tested Postgres/Redis/OTel deployments.</w:t>
+      </w:r>
+    </w:p>
+    <w:p>
+      <w:r>
+        <w:t xml:space="preserve">Capability matrix: Provider adapters - implemented; Usage quotas - implemented for call/tool/spend caps plus fail-open webhook, no Stripe/Chargebee ledger; Compliance/PII - implemented with limits; Isolation - implemented but heuristic/classifier-dependent; Safety rules - implemented; ToolGuard - strong MVP, not a sandbox; HITL - Slack plus workflow primitives, persistence depends on backend configuration; Reliability - timeouts/circuit breaker implemented, chaos recovery not proven; Trace/hash chain - implemented; Sepolia anchoring - optional real testnet tx path, no production key-management story; S3 cold archive - MVP wrapper, needs AWS lifecycle/KMS runbooks; RCA - useful for linear and tool traces, not full emergent multi-agent forensics; Observability - metrics and spans implemented, dashboards not battle-tested; Load testing - smoke-tested only, no published scale benchmark yet; Dashboard - tenant-scoped config, Redis-backed throttling, usage page, not SSO/OIDC/RBAC; QuantumLayer - research only, not near-term product.</w:t>
       </w:r>
     </w:p>
     <w:p>

</xml_diff>

<commit_message>
Validate v0.4 live release
</commit_message>
<xml_diff>
--- a/docs/Veritrace-Design-Document.docx
+++ b/docs/Veritrace-Design-Document.docx
@@ -30,12 +30,12 @@
     </w:p>
     <w:p>
       <w:r>
-        <w:t xml:space="preserve">This section is intentionally blunt. The original vision in this document is the target architecture, not a claim that every enterprise-grade control is mature today. Current local validation: python -m pytest -q --tb=no passes with 344 passing, 3 expected xfails, and 2 warnings. A syntax-health test now compiles every Python source file so store.py-style collection failures are caught immediately.</w:t>
-      </w:r>
-    </w:p>
-    <w:p>
-      <w:r>
-        <w:t xml:space="preserve">What is implemented and tested today: orchestrated pipeline, TraceEvent contract, hash-chain audit, RCA replay/counterfactual basics, context-guarded PII scrubbing, isolation heuristics with classifier hook, SafetyLayer rules, ToolGuardLayer with JSON-schema-style validation, side-effect taxonomy, argument injection scanning, output provenance checks, dangerous tool-chain escalation, Slack HITL with signed callbacks, API-key plus JWT auth, rate limiting, per-tenant usage quotas, fail-open usage/billing webhooks, quota/rate-limit interaction tests, Redis/Postgres backend options, Docker Compose, CLI init/validate/redteam, OpenTelemetry layer spans, compliance report helpers, optional real Sepolia anchoring, encrypted S3 cold archive wrapper, syntax-health checks, concurrency smoke tests, and an admin dashboard skeleton with tenant-scoped config plus explicit super-admin opt-in.</w:t>
+        <w:t xml:space="preserve">This section is intentionally blunt. The original vision in this document is the target architecture, not a claim that every enterprise-grade control is mature today. Current local validation: python -m pytest -q --tb=no passes with 345 passing, 3 expected xfails, and 2 warnings. A syntax-health test now compiles every Python source file so store.py-style collection failures are caught immediately.</w:t>
+      </w:r>
+    </w:p>
+    <w:p>
+      <w:r>
+        <w:t xml:space="preserve">What is implemented and tested today: orchestrated pipeline, TraceEvent contract, hash-chain audit, RCA replay/counterfactual basics, context-guarded PII scrubbing, isolation heuristics with classifier hook, SafetyLayer rules, ToolGuardLayer with JSON-schema-style validation, side-effect taxonomy, argument injection scanning, output provenance checks, dangerous tool-chain escalation, Slack HITL with signed callbacks, API-key plus JWT auth, rate limiting, per-tenant usage quotas, fail-open usage/billing webhooks, quota/rate-limit interaction tests, Redis/Postgres backend options, Docker Compose, CLI init/validate/redteam, OpenTelemetry layer spans, compliance report helpers, optional real Sepolia anchoring validated on tx 0x8d0d7bd15c377224acee00f397272bab1007c757080f19523cfc66c8461b5d99, encrypted S3 cold archive wrapper with live archive/restore validation, syntax-health checks, concurrency smoke tests, and an admin dashboard skeleton with tenant-scoped config plus explicit super-admin opt-in.</w:t>
       </w:r>
     </w:p>
     <w:p>
@@ -50,7 +50,7 @@
     </w:p>
     <w:p>
       <w:r>
-        <w:t xml:space="preserve">Capability matrix: Provider adapters - implemented; Usage quotas - implemented for call/tool/spend caps plus fail-open webhook, no Stripe/Chargebee ledger; Compliance/PII - implemented with limits; Isolation - implemented but heuristic/classifier-dependent; Safety rules - implemented; ToolGuard - strong MVP, not a sandbox; HITL - Slack plus workflow primitives, persistence depends on backend configuration; Reliability - timeouts/circuit breaker implemented, chaos recovery not proven; Trace/hash chain - implemented; Sepolia anchoring - optional real testnet tx path, no production key-management story; S3 cold archive - MVP wrapper, needs AWS lifecycle/KMS runbooks; RCA - useful for linear and tool traces, not full emergent multi-agent forensics; Observability - metrics and spans implemented, dashboards not battle-tested; Load testing - smoke-tested only, no published scale benchmark yet; Dashboard - tenant-scoped config, Redis-backed throttling, usage page, not SSO/OIDC/RBAC; QuantumLayer - research only, not near-term product.</w:t>
+        <w:t xml:space="preserve">Capability matrix: Provider adapters - implemented; Usage quotas - implemented for call/tool/spend caps plus fail-open webhook, no Stripe/Chargebee ledger; Compliance/PII - implemented with limits; Isolation - implemented but heuristic/classifier-dependent; Safety rules - implemented; ToolGuard - strong MVP, not a sandbox; HITL - Slack plus workflow primitives, persistence depends on backend configuration; Reliability - timeouts/circuit breaker implemented, chaos recovery not proven; Trace/hash chain - implemented; Sepolia anchoring - live testnet tx verified (0x8d0d7bd15c377224acee00f397272bab1007c757080f19523cfc66c8461b5d99), no production key-management story; S3 cold archive - live AWS archive/restore smoke test passed, needs AWS lifecycle/KMS runbooks; RCA - useful for linear and tool traces, not full emergent multi-agent forensics; Observability - metrics and spans implemented, dashboards not battle-tested; Load testing - smoke-tested only, no published scale benchmark yet; Dashboard - tenant-scoped config, Redis-backed throttling, usage page, not SSO/OIDC/RBAC; QuantumLayer - research only, not near-term product.</w:t>
       </w:r>
     </w:p>
     <w:p>

</xml_diff>

<commit_message>
Validate authenticated Docker compose load
</commit_message>
<xml_diff>
--- a/docs/Veritrace-Design-Document.docx
+++ b/docs/Veritrace-Design-Document.docx
@@ -30,12 +30,12 @@
     </w:p>
     <w:p>
       <w:r>
-        <w:t xml:space="preserve">This section is intentionally blunt. The original vision in this document is the target architecture, not a claim that every enterprise-grade control is mature today. Current local validation: python -m pytest -q --tb=no passes with 345 passing, 3 expected xfails, and 2 warnings. A syntax-health test now compiles every Python source file so store.py-style collection failures are caught immediately.</w:t>
-      </w:r>
-    </w:p>
-    <w:p>
-      <w:r>
-        <w:t xml:space="preserve">What is implemented and tested today: orchestrated pipeline, TraceEvent contract, hash-chain audit, RCA replay/counterfactual basics, context-guarded PII scrubbing, isolation heuristics with classifier hook, SafetyLayer rules, ToolGuardLayer with JSON-schema-style validation, side-effect taxonomy, argument injection scanning, output provenance checks, dangerous tool-chain escalation, Slack HITL with signed callbacks, API-key plus JWT auth, rate limiting, per-tenant usage quotas, fail-open usage/billing webhooks, quota/rate-limit interaction tests, Redis/Postgres backend options, Docker Compose, CLI init/validate/redteam, OpenTelemetry layer spans, compliance report helpers, optional real Sepolia anchoring validated on tx 0x8d0d7bd15c377224acee00f397272bab1007c757080f19523cfc66c8461b5d99, encrypted S3 cold archive wrapper with live archive/restore validation, syntax-health checks, concurrency smoke tests, and an admin dashboard skeleton with tenant-scoped config plus explicit super-admin opt-in.</w:t>
+        <w:t xml:space="preserve">This section is intentionally blunt. The original vision in this document is the target architecture, not a claim that every enterprise-grade control is mature today. Current local validation: python -m pytest -q --tb=no passes with 346 passing, 3 expected xfails, and 2 warnings. A syntax-health test now compiles every Python source file so store.py-style collection failures are caught immediately.</w:t>
+      </w:r>
+    </w:p>
+    <w:p>
+      <w:r>
+        <w:t xml:space="preserve">What is implemented and tested today: orchestrated pipeline, TraceEvent contract, hash-chain audit, RCA replay/counterfactual basics, context-guarded PII scrubbing, isolation heuristics with classifier hook, SafetyLayer rules, ToolGuardLayer with JSON-schema-style validation, side-effect taxonomy, argument injection scanning, output provenance checks, dangerous tool-chain escalation, Slack HITL with signed callbacks, API-key plus JWT auth, rate limiting, per-tenant usage quotas, fail-open usage/billing webhooks, quota/rate-limit interaction tests, Redis/Postgres backend options, Docker Compose with authenticated 10-minute local load validation, CLI init/validate/redteam, OpenTelemetry layer spans, compliance report helpers, optional real Sepolia anchoring validated on tx 0x8d0d7bd15c377224acee00f397272bab1007c757080f19523cfc66c8461b5d99, encrypted S3 cold archive wrapper with live archive/restore validation, syntax-health checks, concurrency smoke tests, and an admin dashboard skeleton with tenant-scoped config plus explicit super-admin opt-in.</w:t>
       </w:r>
     </w:p>
     <w:p>
@@ -50,7 +50,7 @@
     </w:p>
     <w:p>
       <w:r>
-        <w:t xml:space="preserve">Capability matrix: Provider adapters - implemented; Usage quotas - implemented for call/tool/spend caps plus fail-open webhook, no Stripe/Chargebee ledger; Compliance/PII - implemented with limits; Isolation - implemented but heuristic/classifier-dependent; Safety rules - implemented; ToolGuard - strong MVP, not a sandbox; HITL - Slack plus workflow primitives, persistence depends on backend configuration; Reliability - timeouts/circuit breaker implemented, chaos recovery not proven; Trace/hash chain - implemented; Sepolia anchoring - live testnet tx verified (0x8d0d7bd15c377224acee00f397272bab1007c757080f19523cfc66c8461b5d99), no production key-management story; S3 cold archive - live AWS archive/restore smoke test passed, needs AWS lifecycle/KMS runbooks; RCA - useful for linear and tool traces, not full emergent multi-agent forensics; Observability - metrics and spans implemented, dashboards not battle-tested; Load testing - smoke-tested only, no published scale benchmark yet; Dashboard - tenant-scoped config, Redis-backed throttling, usage page, not SSO/OIDC/RBAC; QuantumLayer - research only, not near-term product.</w:t>
+        <w:t xml:space="preserve">Capability matrix: Provider adapters - implemented; Usage quotas - implemented for call/tool/spend caps plus fail-open webhook, no Stripe/Chargebee ledger; Compliance/PII - implemented with limits; Isolation - implemented but heuristic/classifier-dependent; Safety rules - implemented; ToolGuard - strong MVP, not a sandbox; HITL - Slack plus workflow primitives, persistence depends on backend configuration; Reliability - timeouts/circuit breaker implemented, chaos recovery not proven; Trace/hash chain - implemented; Sepolia anchoring - live testnet tx verified (0x8d0d7bd15c377224acee00f397272bab1007c757080f19523cfc66c8461b5d99), no production key-management story; S3 cold archive - live AWS archive/restore smoke test passed, needs AWS lifecycle/KMS runbooks; RCA - useful for linear and tool traces, not full emergent multi-agent forensics; Observability - metrics and spans implemented, dashboards not battle-tested; Load testing - authenticated local Docker Compose run passed 12,000 requests with 0 errors and 0 HTTP 5xx; still not chaos/SLA testing; Dashboard - tenant-scoped config, Redis-backed throttling, usage page, not SSO/OIDC/RBAC; QuantumLayer - research only, not near-term product.</w:t>
       </w:r>
     </w:p>
     <w:p>

</xml_diff>